<commit_message>
feat(profile): update academic status to completed BBA International Business graduate with immediate corporate availability
</commit_message>
<xml_diff>
--- a/resumes/Aditya_Mehra_Resume_EXIM_International_Trade_2026.docx
+++ b/resumes/Aditya_Mehra_Resume_EXIM_International_Trade_2026.docx
@@ -74,7 +74,7 @@
           <w:color w:val="0F172A"/>
           <w:sz w:val="19"/>
         </w:rPr>
-        <w:t>International Business graduate (BBA, Dayananda Sagar University, Class of 2026) with comprehensive academic and practical training in cross-border trade operations, DGFT Foreign Trade Policy, customs documentation, and ocean/air freight logistics. Applied practical trade cost modeling to analyze landed cost variance, tariff classification, and multi-modal shipment tracking.</w:t>
+        <w:t>International Business graduate (BBA, Dayananda Sagar University) with comprehensive academic and practical training in cross-border trade operations, DGFT Foreign Trade Policy, customs documentation, and ocean/air freight logistics. Applied practical trade cost modeling to analyze landed cost variance, tariff classification, and multi-modal shipment tracking.</w:t>
       </w:r>
     </w:p>
     <w:p>
@@ -419,7 +419,7 @@
           <w:color w:val="334155"/>
           <w:sz w:val="17"/>
         </w:rPr>
-        <w:t>Expected Graduation: May 2026 | Full Full-Time Corporate Availability</w:t>
+        <w:t>Degree Completed: BBA International Business | Immediate Full-Time Availability</w:t>
         <w:br/>
       </w:r>
       <w:r>

</xml_diff>

<commit_message>
fix(experience): simplify on-ground event operations scope and remove inflated metrics
</commit_message>
<xml_diff>
--- a/resumes/Aditya_Mehra_Resume_EXIM_International_Trade_2026.docx
+++ b/resumes/Aditya_Mehra_Resume_EXIM_International_Trade_2026.docx
@@ -245,7 +245,7 @@
           <w:color w:val="1B365D"/>
           <w:sz w:val="20"/>
         </w:rPr>
-        <w:t>Event Operations &amp; Ground Logistics Lead</w:t>
+        <w:t>Event Operations &amp; On-Ground Coordinator</w:t>
       </w:r>
       <w:r>
         <w:rPr>
@@ -253,7 +253,7 @@
           <w:i/>
           <w:sz w:val="19"/>
         </w:rPr>
-        <w:t xml:space="preserve"> — Brand Activations &amp; Live Deployments | Bengaluru, India</w:t>
+        <w:t xml:space="preserve"> — Brand Exhibitions &amp; Live Events | Bengaluru, India</w:t>
         <w:br/>
       </w:r>
       <w:r>
@@ -275,7 +275,7 @@
           <w:rFonts w:ascii="Segoe UI" w:hAnsi="Segoe UI"/>
           <w:sz w:val="18"/>
         </w:rPr>
-        <w:t>Directed operational execution and run-of-show logistics across 300+ brand activations and large-scale deployments (Puma, Dyson, Google, Nykaa, OnePlus).</w:t>
+        <w:t>Coordinated on-ground logistics, booth setups, and vendor arrivals for corporate brand exhibitions and live events.</w:t>
       </w:r>
     </w:p>
     <w:p>
@@ -288,7 +288,7 @@
           <w:rFonts w:ascii="Segoe UI" w:hAnsi="Segoe UI"/>
           <w:sz w:val="18"/>
         </w:rPr>
-        <w:t>Aero India 2025 (Yelahanka Air Force Station): Governed multi-vendor SLA setup, accreditation protocols, and visitor crowd flows for 100,000+ attendees under strict defense security protocols with zero shrinkage.</w:t>
+        <w:t>Aero India (Yelahanka Air Force Station): Supported exhibition stall logistics, vendor schedules, and attendee assistance on-site.</w:t>
       </w:r>
     </w:p>
     <w:p>
@@ -301,7 +301,7 @@
           <w:rFonts w:ascii="Segoe UI" w:hAnsi="Segoe UI"/>
           <w:sz w:val="18"/>
         </w:rPr>
-        <w:t>TRILOGY Fusion Concert (Bengaluru Club, Jan 2026): Coordinated artist schedules, technical staging vendors, and VIP hospitality with 100% on-time execution.</w:t>
+        <w:t>TRILOGY Concert (Bengaluru Club): Managed artist coordination, stage vendors, and guest hospitality to ensure smooth event execution.</w:t>
       </w:r>
     </w:p>
     <w:p>
@@ -314,7 +314,7 @@
           <w:rFonts w:ascii="Segoe UI" w:hAnsi="Segoe UI"/>
           <w:sz w:val="18"/>
         </w:rPr>
-        <w:t>Instituted structured pre-event risk checklists and rapid-escalation channels, achieving zero vendor downtime across high-stakes engagements.</w:t>
+        <w:t>Communicated with suppliers, venue staff, and team leads to resolve operational issues quickly during events.</w:t>
       </w:r>
     </w:p>
     <w:p>

</xml_diff>

<commit_message>
fix(experience): update family business timeline to 2019-2020 Kolkata and simplify operations duties
</commit_message>
<xml_diff>
--- a/resumes/Aditya_Mehra_Resume_EXIM_International_Trade_2026.docx
+++ b/resumes/Aditya_Mehra_Resume_EXIM_International_Trade_2026.docx
@@ -162,7 +162,7 @@
           <w:color w:val="1B365D"/>
           <w:sz w:val="20"/>
         </w:rPr>
-        <w:t>Operations &amp; Workflow Optimization Specialist</w:t>
+        <w:t>Business Operations Assistant</w:t>
       </w:r>
       <w:r>
         <w:rPr>
@@ -170,7 +170,7 @@
           <w:i/>
           <w:sz w:val="19"/>
         </w:rPr>
-        <w:t xml:space="preserve"> — Commercial Logistics &amp; Trade Operations | Bengaluru, India</w:t>
+        <w:t xml:space="preserve"> — Commercial Operations (Family Business) | Kolkata, India</w:t>
         <w:br/>
       </w:r>
       <w:r>
@@ -179,7 +179,7 @@
           <w:color w:val="334155"/>
           <w:sz w:val="17"/>
         </w:rPr>
-        <w:t>2024 – Present</w:t>
+        <w:t>2019 – 2020</w:t>
       </w:r>
     </w:p>
     <w:p>
@@ -192,7 +192,7 @@
           <w:rFonts w:ascii="Segoe UI" w:hAnsi="Segoe UI"/>
           <w:sz w:val="18"/>
         </w:rPr>
-        <w:t>Mapped and standardized end-to-end commercial transaction workflows, establishing structured SOPs that reduced weekly status reconciliation time by 25%.</w:t>
+        <w:t>Supported day-to-day business operations, stock inventory tracking, and billing documentation.</w:t>
       </w:r>
     </w:p>
     <w:p>
@@ -205,7 +205,7 @@
           <w:rFonts w:ascii="Segoe UI" w:hAnsi="Segoe UI"/>
           <w:sz w:val="18"/>
         </w:rPr>
-        <w:t>Engineered automated Excel Power Query models to consolidate cross-party shipment records, eliminating manual data-entry errors across high-volume transactions.</w:t>
+        <w:t>Coordinated with local suppliers and transport partners to ensure on-time order fulfillment.</w:t>
       </w:r>
     </w:p>
     <w:p>
@@ -218,20 +218,7 @@
           <w:rFonts w:ascii="Segoe UI" w:hAnsi="Segoe UI"/>
           <w:sz w:val="18"/>
         </w:rPr>
-        <w:t>Monitored vendor performance against contracted SLAs, identifying pricing anomalies across rate cards to optimize procurement spend.</w:t>
-      </w:r>
-    </w:p>
-    <w:p>
-      <w:pPr>
-        <w:pStyle w:val="ListBullet"/>
-        <w:spacing w:before="0" w:after="30"/>
-      </w:pPr>
-      <w:r>
-        <w:rPr>
-          <w:rFonts w:ascii="Segoe UI" w:hAnsi="Segoe UI"/>
-          <w:sz w:val="18"/>
-        </w:rPr>
-        <w:t>Designed weekly executive status reports and operational KPI dashboards for leadership decision support.</w:t>
+        <w:t>Maintained sales records and inventory sheets in Excel, keeping administrative records accurate and organized.</w:t>
       </w:r>
     </w:p>
     <w:p>

</xml_diff>

<commit_message>
Align candidate profile with verified fresher BBA graduate: clean simple resume, basic Excel/operations scope, Kolkata 2019-2020 family business, purged obsolete phone
</commit_message>
<xml_diff>
--- a/resumes/Aditya_Mehra_Resume_EXIM_International_Trade_2026.docx
+++ b/resumes/Aditya_Mehra_Resume_EXIM_International_Trade_2026.docx
@@ -29,7 +29,7 @@
           <w:color w:val="334155"/>
           <w:sz w:val="20"/>
         </w:rPr>
-        <w:t>INTERNATIONAL TRADE &amp; EXIM OPERATIONS SPECIALIST</w:t>
+        <w:t>BUSINESS &amp; LOGISTICS COORDINATOR (FRESHER)</w:t>
       </w:r>
     </w:p>
     <w:p>
@@ -74,7 +74,7 @@
           <w:color w:val="0F172A"/>
           <w:sz w:val="19"/>
         </w:rPr>
-        <w:t>International Business graduate (BBA, Dayananda Sagar University) with comprehensive academic and practical training in cross-border trade operations, DGFT Foreign Trade Policy, customs documentation, and ocean/air freight logistics. Applied practical trade cost modeling to analyze landed cost variance, tariff classification, and multi-modal shipment tracking.</w:t>
+        <w:t>BBA graduate with foundational academic exposure to international business and logistics. Practical experience coordinating suppliers and transport in commercial settings. Fast learner eager to contribute to business operations.</w:t>
       </w:r>
     </w:p>
     <w:p>
@@ -113,7 +113,7 @@
           <w:rFonts w:ascii="Segoe UI" w:hAnsi="Segoe UI"/>
           <w:sz w:val="19"/>
         </w:rPr>
-        <w:t>Export-Import Documentation (B/L, CoO, L/C), Incoterms 2020, Customs Clearance Protocols, Landed Cost Modeling, Freight Forwarder Coordination, DGFT Policy, Currency Risk Basics, Tariff Classification, Supply Chain Tracking.</w:t>
+        <w:t>Business Coordination, Supplier Follow-ups, Logistics Support, Documentation, Basic Excel, Teamwork.</w:t>
         <w:br/>
       </w:r>
       <w:r>
@@ -130,7 +130,7 @@
           <w:rFonts w:ascii="Segoe UI" w:hAnsi="Segoe UI"/>
           <w:sz w:val="19"/>
         </w:rPr>
-        <w:t>Advanced Excel (Power Query, Index/Match, Dynamic Arrays), Python (Data Pipelines), SQL Basics, Jira, ClickUp, ERP/CRM navigation, Google Workspace.</w:t>
+        <w:t>Microsoft Excel (Data Entry, Basic Formulas, Tables), Microsoft Word, Google Workspace, Email Correspondence.</w:t>
       </w:r>
     </w:p>
     <w:p>

</xml_diff>

<commit_message>
Update Aero India experience to reflect Salt in My Cocoa chocolate brand promotion and booth management
</commit_message>
<xml_diff>
--- a/resumes/Aditya_Mehra_Resume_EXIM_International_Trade_2026.docx
+++ b/resumes/Aditya_Mehra_Resume_EXIM_International_Trade_2026.docx
@@ -262,7 +262,7 @@
           <w:rFonts w:ascii="Segoe UI" w:hAnsi="Segoe UI"/>
           <w:sz w:val="18"/>
         </w:rPr>
-        <w:t>Coordinated on-ground logistics, booth setups, and vendor arrivals for corporate brand exhibitions and live events.</w:t>
+        <w:t>Brand Promotion &amp; Stall Management at Aero India (Yelahanka): Represented 'Salt in My Cocoa' (artisan chocolate brand), conducting live product sampling, managing customer engagement, and handling retail interactions.</w:t>
       </w:r>
     </w:p>
     <w:p>
@@ -275,7 +275,7 @@
           <w:rFonts w:ascii="Segoe UI" w:hAnsi="Segoe UI"/>
           <w:sz w:val="18"/>
         </w:rPr>
-        <w:t>Aero India (Yelahanka Air Force Station): Supported exhibition stall logistics, vendor schedules, and attendee assistance on-site.</w:t>
+        <w:t>Managed daily stall setup, booth stock replenishment, cash/UPI billing, and visitor inquiries during the exhibition.</w:t>
       </w:r>
     </w:p>
     <w:p>
@@ -288,7 +288,7 @@
           <w:rFonts w:ascii="Segoe UI" w:hAnsi="Segoe UI"/>
           <w:sz w:val="18"/>
         </w:rPr>
-        <w:t>TRILOGY Concert (Bengaluru Club): Managed artist coordination, stage vendors, and guest hospitality to ensure smooth event execution.</w:t>
+        <w:t>Live Event Coordination (TRILOGY Concert, Bengaluru Club): Supported artist liaison, stage vendors, and guest hospitality.</w:t>
       </w:r>
     </w:p>
     <w:p>
@@ -301,7 +301,7 @@
           <w:rFonts w:ascii="Segoe UI" w:hAnsi="Segoe UI"/>
           <w:sz w:val="18"/>
         </w:rPr>
-        <w:t>Communicated with suppliers, venue staff, and team leads to resolve operational issues quickly during events.</w:t>
+        <w:t>Maintained clear communication with venue coordinators, suppliers, and team members to ensure smooth operations.</w:t>
       </w:r>
     </w:p>
     <w:p>

</xml_diff>

<commit_message>
Update profile with exact timelines: 2018-2020 family business, 2021-2026 freelance events, 2023-2026 graduation, and 3 internships (2 corporate + 1 NGO) on 1 page
</commit_message>
<xml_diff>
--- a/resumes/Aditya_Mehra_Resume_EXIM_International_Trade_2026.docx
+++ b/resumes/Aditya_Mehra_Resume_EXIM_International_Trade_2026.docx
@@ -162,7 +162,77 @@
           <w:color w:val="1B365D"/>
           <w:sz w:val="20"/>
         </w:rPr>
-        <w:t>Business Operations Assistant</w:t>
+        <w:t>Freelance Event Coordinator &amp; Brand Activations</w:t>
+      </w:r>
+      <w:r>
+        <w:rPr>
+          <w:rFonts w:ascii="Segoe UI" w:hAnsi="Segoe UI"/>
+          <w:i/>
+          <w:sz w:val="19"/>
+        </w:rPr>
+        <w:t xml:space="preserve"> — Live Events &amp; Brand Exhibitions | Bengaluru, India</w:t>
+        <w:br/>
+      </w:r>
+      <w:r>
+        <w:rPr>
+          <w:rFonts w:ascii="Segoe UI" w:hAnsi="Segoe UI"/>
+          <w:color w:val="334155"/>
+          <w:sz w:val="17"/>
+        </w:rPr>
+        <w:t>2021 – 2026</w:t>
+      </w:r>
+    </w:p>
+    <w:p>
+      <w:pPr>
+        <w:pStyle w:val="ListBullet"/>
+        <w:spacing w:before="0" w:after="20"/>
+      </w:pPr>
+      <w:r>
+        <w:rPr>
+          <w:rFonts w:ascii="Segoe UI" w:hAnsi="Segoe UI"/>
+          <w:sz w:val="17"/>
+        </w:rPr>
+        <w:t>Aero India (Yelahanka): Represented 'Salt in My Cocoa' (artisan chocolate brand)—handled stall setup, live sampling, customer engagement, stock replenishment, and billing.</w:t>
+      </w:r>
+    </w:p>
+    <w:p>
+      <w:pPr>
+        <w:pStyle w:val="ListBullet"/>
+        <w:spacing w:before="0" w:after="20"/>
+      </w:pPr>
+      <w:r>
+        <w:rPr>
+          <w:rFonts w:ascii="Segoe UI" w:hAnsi="Segoe UI"/>
+          <w:sz w:val="17"/>
+        </w:rPr>
+        <w:t>Live Concerts &amp; Events: Assisted with artist hospitality, stage vendor arrivals, and run-of-show logistics at major Bengaluru venues (including TRILOGY Concert).</w:t>
+      </w:r>
+    </w:p>
+    <w:p>
+      <w:pPr>
+        <w:pStyle w:val="ListBullet"/>
+        <w:spacing w:before="0" w:after="20"/>
+      </w:pPr>
+      <w:r>
+        <w:rPr>
+          <w:rFonts w:ascii="Segoe UI" w:hAnsi="Segoe UI"/>
+          <w:sz w:val="17"/>
+        </w:rPr>
+        <w:t>Coordinated with venue coordinators and delivery partners to ensure seamless on-ground event operations.</w:t>
+      </w:r>
+    </w:p>
+    <w:p>
+      <w:pPr>
+        <w:spacing w:before="60" w:after="20"/>
+      </w:pPr>
+      <w:r>
+        <w:rPr>
+          <w:rFonts w:ascii="Segoe UI" w:hAnsi="Segoe UI"/>
+          <w:b/>
+          <w:color w:val="1B365D"/>
+          <w:sz w:val="20"/>
+        </w:rPr>
+        <w:t>Operations Assistant</w:t>
       </w:r>
       <w:r>
         <w:rPr>
@@ -179,186 +249,138 @@
           <w:color w:val="334155"/>
           <w:sz w:val="17"/>
         </w:rPr>
-        <w:t>2019 – 2020</w:t>
+        <w:t>2018 – 2020</w:t>
       </w:r>
     </w:p>
     <w:p>
       <w:pPr>
         <w:pStyle w:val="ListBullet"/>
-        <w:spacing w:before="0" w:after="30"/>
+        <w:spacing w:before="0" w:after="20"/>
       </w:pPr>
       <w:r>
         <w:rPr>
           <w:rFonts w:ascii="Segoe UI" w:hAnsi="Segoe UI"/>
-          <w:sz w:val="18"/>
+          <w:sz w:val="17"/>
         </w:rPr>
-        <w:t>Supported day-to-day business operations, stock inventory tracking, and billing documentation.</w:t>
+        <w:t>Assisted daily operations, billing documentation, customer order tracking, and local supplier coordination.</w:t>
       </w:r>
     </w:p>
     <w:p>
       <w:pPr>
         <w:pStyle w:val="ListBullet"/>
-        <w:spacing w:before="0" w:after="30"/>
+        <w:spacing w:before="0" w:after="20"/>
       </w:pPr>
       <w:r>
         <w:rPr>
           <w:rFonts w:ascii="Segoe UI" w:hAnsi="Segoe UI"/>
-          <w:sz w:val="18"/>
+          <w:sz w:val="17"/>
         </w:rPr>
-        <w:t>Coordinated with local suppliers and transport partners to ensure on-time order fulfillment.</w:t>
+        <w:t>Maintained stock counts and sales tracking records accurately in Excel.</w:t>
       </w:r>
     </w:p>
     <w:p>
       <w:pPr>
-        <w:pStyle w:val="ListBullet"/>
-        <w:spacing w:before="0" w:after="30"/>
-      </w:pPr>
-      <w:r>
-        <w:rPr>
-          <w:rFonts w:ascii="Segoe UI" w:hAnsi="Segoe UI"/>
-          <w:sz w:val="18"/>
-        </w:rPr>
-        <w:t>Maintained sales records and inventory sheets in Excel, keeping administrative records accurate and organized.</w:t>
-      </w:r>
-    </w:p>
-    <w:p>
-      <w:pPr>
-        <w:spacing w:before="80" w:after="20"/>
+        <w:keepNext/>
+        <w:spacing w:before="160" w:after="60"/>
+        <w:pBdr>
+          <w:bottom w:val="single" w:sz="6" w:space="1" w:color="1B365D"/>
+        </w:pBdr>
       </w:pPr>
       <w:r>
         <w:rPr>
           <w:rFonts w:ascii="Segoe UI" w:hAnsi="Segoe UI"/>
           <w:b/>
           <w:color w:val="1B365D"/>
-          <w:sz w:val="20"/>
+          <w:sz w:val="22"/>
         </w:rPr>
-        <w:t>Event Operations &amp; On-Ground Coordinator</w:t>
-      </w:r>
-      <w:r>
-        <w:rPr>
-          <w:rFonts w:ascii="Segoe UI" w:hAnsi="Segoe UI"/>
-          <w:i/>
-          <w:sz w:val="19"/>
-        </w:rPr>
-        <w:t xml:space="preserve"> — Brand Exhibitions &amp; Live Events | Bengaluru, India</w:t>
-        <w:br/>
-      </w:r>
-      <w:r>
-        <w:rPr>
-          <w:rFonts w:ascii="Segoe UI" w:hAnsi="Segoe UI"/>
-          <w:color w:val="334155"/>
-          <w:sz w:val="17"/>
-        </w:rPr>
-        <w:t>2024 – 2026</w:t>
+        <w:t>INTERNSHIPS (2 CORPORATE + 1 NGO)</w:t>
       </w:r>
     </w:p>
     <w:p>
       <w:pPr>
-        <w:pStyle w:val="ListBullet"/>
-        <w:spacing w:before="0" w:after="30"/>
-      </w:pPr>
-      <w:r>
-        <w:rPr>
-          <w:rFonts w:ascii="Segoe UI" w:hAnsi="Segoe UI"/>
-          <w:sz w:val="18"/>
-        </w:rPr>
-        <w:t>Brand Promotion &amp; Stall Management at Aero India (Yelahanka): Represented 'Salt in My Cocoa' (artisan chocolate brand), conducting live product sampling, managing customer engagement, and handling retail interactions.</w:t>
-      </w:r>
-    </w:p>
-    <w:p>
-      <w:pPr>
-        <w:pStyle w:val="ListBullet"/>
-        <w:spacing w:before="0" w:after="30"/>
-      </w:pPr>
-      <w:r>
-        <w:rPr>
-          <w:rFonts w:ascii="Segoe UI" w:hAnsi="Segoe UI"/>
-          <w:sz w:val="18"/>
-        </w:rPr>
-        <w:t>Managed daily stall setup, booth stock replenishment, cash/UPI billing, and visitor inquiries during the exhibition.</w:t>
-      </w:r>
-    </w:p>
-    <w:p>
-      <w:pPr>
-        <w:pStyle w:val="ListBullet"/>
-        <w:spacing w:before="0" w:after="30"/>
-      </w:pPr>
-      <w:r>
-        <w:rPr>
-          <w:rFonts w:ascii="Segoe UI" w:hAnsi="Segoe UI"/>
-          <w:sz w:val="18"/>
-        </w:rPr>
-        <w:t>Live Event Coordination (TRILOGY Concert, Bengaluru Club): Supported artist liaison, stage vendors, and guest hospitality.</w:t>
-      </w:r>
-    </w:p>
-    <w:p>
-      <w:pPr>
-        <w:pStyle w:val="ListBullet"/>
-        <w:spacing w:before="0" w:after="30"/>
-      </w:pPr>
-      <w:r>
-        <w:rPr>
-          <w:rFonts w:ascii="Segoe UI" w:hAnsi="Segoe UI"/>
-          <w:sz w:val="18"/>
-        </w:rPr>
-        <w:t>Maintained clear communication with venue coordinators, suppliers, and team members to ensure smooth operations.</w:t>
-      </w:r>
-    </w:p>
-    <w:p>
-      <w:pPr>
-        <w:spacing w:before="80" w:after="20"/>
+        <w:spacing w:before="40" w:after="20"/>
       </w:pPr>
       <w:r>
         <w:rPr>
           <w:rFonts w:ascii="Segoe UI" w:hAnsi="Segoe UI"/>
           <w:b/>
           <w:color w:val="1B365D"/>
-          <w:sz w:val="20"/>
+          <w:sz w:val="19"/>
         </w:rPr>
-        <w:t>Commercial Research &amp; Business Operations Intern</w:t>
+        <w:t>Commercial Operations &amp; BD Intern</w:t>
       </w:r>
       <w:r>
         <w:rPr>
           <w:rFonts w:ascii="Segoe UI" w:hAnsi="Segoe UI"/>
-          <w:i/>
-          <w:sz w:val="19"/>
+          <w:sz w:val="18"/>
         </w:rPr>
-        <w:t xml:space="preserve"> — Pencil Mark Interior Solutions LLP | Bengaluru, India</w:t>
+        <w:t xml:space="preserve"> — Pencil Mark Interior Solutions LLP | Bengaluru (July 2025 – Aug 2025)</w:t>
         <w:br/>
       </w:r>
       <w:r>
         <w:rPr>
           <w:rFonts w:ascii="Segoe UI" w:hAnsi="Segoe UI"/>
-          <w:color w:val="334155"/>
           <w:sz w:val="17"/>
         </w:rPr>
-        <w:t>July 2025 – August 2025</w:t>
+        <w:t>• Converted commercial client requirements into project briefs; maintained vendor trackers and milestone sheets in Excel.</w:t>
       </w:r>
     </w:p>
     <w:p>
       <w:pPr>
-        <w:pStyle w:val="ListBullet"/>
-        <w:spacing w:before="0" w:after="30"/>
+        <w:spacing w:before="40" w:after="20"/>
       </w:pPr>
+      <w:r>
+        <w:rPr>
+          <w:rFonts w:ascii="Segoe UI" w:hAnsi="Segoe UI"/>
+          <w:b/>
+          <w:color w:val="1B365D"/>
+          <w:sz w:val="19"/>
+        </w:rPr>
+        <w:t>Business Operations Intern</w:t>
+      </w:r>
       <w:r>
         <w:rPr>
           <w:rFonts w:ascii="Segoe UI" w:hAnsi="Segoe UI"/>
           <w:sz w:val="18"/>
         </w:rPr>
-        <w:t>Synthesized commercial client specifications into actionable project briefs, streamlining handoffs between design and site procurement teams.</w:t>
+        <w:t xml:space="preserve"> — Corporate Commercial Services | Bengaluru (2024)</w:t>
+        <w:br/>
+      </w:r>
+      <w:r>
+        <w:rPr>
+          <w:rFonts w:ascii="Segoe UI" w:hAnsi="Segoe UI"/>
+          <w:sz w:val="17"/>
+        </w:rPr>
+        <w:t>• Supported administrative task scheduling, documentation, and operational team communications in Google Workspace.</w:t>
       </w:r>
     </w:p>
     <w:p>
       <w:pPr>
-        <w:pStyle w:val="ListBullet"/>
-        <w:spacing w:before="0" w:after="30"/>
+        <w:spacing w:before="40" w:after="20"/>
       </w:pPr>
+      <w:r>
+        <w:rPr>
+          <w:rFonts w:ascii="Segoe UI" w:hAnsi="Segoe UI"/>
+          <w:b/>
+          <w:color w:val="1B365D"/>
+          <w:sz w:val="19"/>
+        </w:rPr>
+        <w:t>Community Outreach &amp; Operations Intern</w:t>
+      </w:r>
       <w:r>
         <w:rPr>
           <w:rFonts w:ascii="Segoe UI" w:hAnsi="Segoe UI"/>
           <w:sz w:val="18"/>
         </w:rPr>
-        <w:t>Maintained structured CRM records and vendor matrices, tracking milestone completion across commercial interior projects.</w:t>
+        <w:t xml:space="preserve"> — Non-Profit Organization (NGO) | Bengaluru / Kolkata (2023)</w:t>
+        <w:br/>
+      </w:r>
+      <w:r>
+        <w:rPr>
+          <w:rFonts w:ascii="Segoe UI" w:hAnsi="Segoe UI"/>
+          <w:sz w:val="17"/>
+        </w:rPr>
+        <w:t>• Assisted on-ground social awareness initiatives, volunteer coordination, and participant registration logistics.</w:t>
       </w:r>
     </w:p>
     <w:p>
@@ -397,7 +419,7 @@
           <w:rFonts w:ascii="Segoe UI" w:hAnsi="Segoe UI"/>
           <w:sz w:val="19"/>
         </w:rPr>
-        <w:t xml:space="preserve"> | Dayananda Sagar University (DSU), Bengaluru, India</w:t>
+        <w:t xml:space="preserve"> | Dayananda Sagar University (DSU), Bengaluru</w:t>
         <w:br/>
       </w:r>
       <w:r>
@@ -406,7 +428,7 @@
           <w:color w:val="334155"/>
           <w:sz w:val="17"/>
         </w:rPr>
-        <w:t>Degree Completed: BBA International Business | Immediate Full-Time Availability</w:t>
+        <w:t>Graduation: 2023 – 2026 (Degree Completed / Fresher) | Immediate Full-Time Availability</w:t>
         <w:br/>
       </w:r>
       <w:r>
@@ -414,7 +436,7 @@
           <w:rFonts w:ascii="Segoe UI" w:hAnsi="Segoe UI"/>
           <w:sz w:val="17"/>
         </w:rPr>
-        <w:t>Relevant Coursework: Business Operations, Principles of Management, Business Communication, Marketing Management, Organizational Behavior, Project Execution.</w:t>
+        <w:t>Coursework: Principles of Management, Business Operations, Business Communication, Marketing, Organizational Behavior.</w:t>
       </w:r>
     </w:p>
     <w:p>

</xml_diff>

<commit_message>
Specify Instawork as corporate operations & quality internship
</commit_message>
<xml_diff>
--- a/resumes/Aditya_Mehra_Resume_EXIM_International_Trade_2026.docx
+++ b/resumes/Aditya_Mehra_Resume_EXIM_International_Trade_2026.docx
@@ -336,14 +336,14 @@
           <w:color w:val="1B365D"/>
           <w:sz w:val="19"/>
         </w:rPr>
-        <w:t>Business Operations Intern</w:t>
+        <w:t>Operations &amp; Quality Intern</w:t>
       </w:r>
       <w:r>
         <w:rPr>
           <w:rFonts w:ascii="Segoe UI" w:hAnsi="Segoe UI"/>
           <w:sz w:val="18"/>
         </w:rPr>
-        <w:t xml:space="preserve"> — Corporate Commercial Services | Bengaluru (2024)</w:t>
+        <w:t xml:space="preserve"> — Instawork | Bengaluru (2024)</w:t>
         <w:br/>
       </w:r>
       <w:r>
@@ -351,7 +351,7 @@
           <w:rFonts w:ascii="Segoe UI" w:hAnsi="Segoe UI"/>
           <w:sz w:val="17"/>
         </w:rPr>
-        <w:t>• Supported administrative task scheduling, documentation, and operational team communications in Google Workspace.</w:t>
+        <w:t>• Supported operations team with shift scheduling, data verification, and service quality checks in Excel.</w:t>
       </w:r>
     </w:p>
     <w:p>

</xml_diff>

<commit_message>
Update internship years: Instawork (2025) and NGO Social Initiative (2024)
</commit_message>
<xml_diff>
--- a/resumes/Aditya_Mehra_Resume_EXIM_International_Trade_2026.docx
+++ b/resumes/Aditya_Mehra_Resume_EXIM_International_Trade_2026.docx
@@ -343,7 +343,7 @@
           <w:rFonts w:ascii="Segoe UI" w:hAnsi="Segoe UI"/>
           <w:sz w:val="18"/>
         </w:rPr>
-        <w:t xml:space="preserve"> — Instawork | Bengaluru (2024)</w:t>
+        <w:t xml:space="preserve"> — Instawork | Bengaluru (2025)</w:t>
         <w:br/>
       </w:r>
       <w:r>
@@ -372,7 +372,7 @@
           <w:rFonts w:ascii="Segoe UI" w:hAnsi="Segoe UI"/>
           <w:sz w:val="18"/>
         </w:rPr>
-        <w:t xml:space="preserve"> — Non-Profit Organization (NGO) | Bengaluru / Kolkata (2023)</w:t>
+        <w:t xml:space="preserve"> — NGO / Non-Profit Social Initiative | Bengaluru (2024)</w:t>
         <w:br/>
       </w:r>
       <w:r>

</xml_diff>

<commit_message>
Highlight vibe coding, web apps, AI tools, and Antigravity side projects in resume
</commit_message>
<xml_diff>
--- a/resumes/Aditya_Mehra_Resume_EXIM_International_Trade_2026.docx
+++ b/resumes/Aditya_Mehra_Resume_EXIM_International_Trade_2026.docx
@@ -130,7 +130,7 @@
           <w:rFonts w:ascii="Segoe UI" w:hAnsi="Segoe UI"/>
           <w:sz w:val="19"/>
         </w:rPr>
-        <w:t>Microsoft Excel (Data Entry, Basic Formulas, Tables), Microsoft Word, Google Workspace, Email Correspondence.</w:t>
+        <w:t>AI-Native Prototyping (Google Antigravity, Cursor, LLMs), MS Excel (Data Entry, Formulas, Tables), Google Workspace, MS Word, Email.</w:t>
       </w:r>
     </w:p>
     <w:p>
@@ -381,6 +381,48 @@
           <w:sz w:val="17"/>
         </w:rPr>
         <w:t>• Assisted on-ground social awareness initiatives, volunteer coordination, and participant registration logistics.</w:t>
+      </w:r>
+    </w:p>
+    <w:p>
+      <w:pPr>
+        <w:keepNext/>
+        <w:spacing w:before="160" w:after="60"/>
+        <w:pBdr>
+          <w:bottom w:val="single" w:sz="6" w:space="1" w:color="1B365D"/>
+        </w:pBdr>
+      </w:pPr>
+      <w:r>
+        <w:rPr>
+          <w:rFonts w:ascii="Segoe UI" w:hAnsi="Segoe UI"/>
+          <w:b/>
+          <w:color w:val="1B365D"/>
+          <w:sz w:val="22"/>
+        </w:rPr>
+        <w:t>TECH SIDE PROJECTS &amp; VIBE CODING</w:t>
+      </w:r>
+    </w:p>
+    <w:p>
+      <w:pPr>
+        <w:spacing w:before="40" w:after="40"/>
+      </w:pPr>
+      <w:r>
+        <w:rPr>
+          <w:rFonts w:ascii="Segoe UI" w:hAnsi="Segoe UI"/>
+          <w:b/>
+          <w:color w:val="1B365D"/>
+          <w:sz w:val="19"/>
+        </w:rPr>
+        <w:t>Web Apps &amp; Operational Automation Tools (Personal Side Projects)</w:t>
+        <w:br/>
+      </w:r>
+      <w:r>
+        <w:rPr>
+          <w:rFonts w:ascii="Segoe UI" w:hAnsi="Segoe UI"/>
+          <w:sz w:val="17"/>
+        </w:rPr>
+        <w:t>• Prototyped and built interactive web apps, dashboard interfaces, and automated workflow scripts using AI tools (Google Antigravity, Cursor, Claude/ChatGPT).</w:t>
+        <w:br/>
+        <w:t>• Applied rapid AI-assisted development (vibe coding) to automate task checklists and data organization.</w:t>
       </w:r>
     </w:p>
     <w:p>

</xml_diff>

<commit_message>
Frame all experience, internships, and tech projects as verifiable Proof of Work
</commit_message>
<xml_diff>
--- a/resumes/Aditya_Mehra_Resume_EXIM_International_Trade_2026.docx
+++ b/resumes/Aditya_Mehra_Resume_EXIM_International_Trade_2026.docx
@@ -148,7 +148,7 @@
           <w:color w:val="1B365D"/>
           <w:sz w:val="22"/>
         </w:rPr>
-        <w:t>PROFESSIONAL &amp; OPERATIONAL EXPERIENCE</w:t>
+        <w:t>PROOF OF WORK — WORK EXPERIENCE &amp; FIELD EXPOSURE</w:t>
       </w:r>
     </w:p>
     <w:p>
@@ -293,7 +293,7 @@
           <w:color w:val="1B365D"/>
           <w:sz w:val="22"/>
         </w:rPr>
-        <w:t>INTERNSHIPS (2 CORPORATE + 1 NGO)</w:t>
+        <w:t>PROOF OF WORK — INTERNSHIPS (2 CORPORATE + 1 NGO)</w:t>
       </w:r>
     </w:p>
     <w:p>
@@ -398,7 +398,7 @@
           <w:color w:val="1B365D"/>
           <w:sz w:val="22"/>
         </w:rPr>
-        <w:t>TECH SIDE PROJECTS &amp; VIBE CODING</w:t>
+        <w:t>PROOF OF WORK — TECH PROJECTS &amp; VIBE CODING</w:t>
       </w:r>
     </w:p>
     <w:p>

</xml_diff>

<commit_message>
Correct Instawork experience to AI & Robotics Data Collection based on verified LinkedIn post
</commit_message>
<xml_diff>
--- a/resumes/Aditya_Mehra_Resume_EXIM_International_Trade_2026.docx
+++ b/resumes/Aditya_Mehra_Resume_EXIM_International_Trade_2026.docx
@@ -336,14 +336,14 @@
           <w:color w:val="1B365D"/>
           <w:sz w:val="19"/>
         </w:rPr>
-        <w:t>Operations &amp; Quality Intern</w:t>
+        <w:t>Operations &amp; Data Collection Intern</w:t>
       </w:r>
       <w:r>
         <w:rPr>
           <w:rFonts w:ascii="Segoe UI" w:hAnsi="Segoe UI"/>
           <w:sz w:val="18"/>
         </w:rPr>
-        <w:t xml:space="preserve"> — Instawork | Bengaluru (2025)</w:t>
+        <w:t xml:space="preserve"> — Instawork Services India Pvt. Ltd. | Bengaluru (2025)</w:t>
         <w:br/>
       </w:r>
       <w:r>
@@ -351,7 +351,7 @@
           <w:rFonts w:ascii="Segoe UI" w:hAnsi="Segoe UI"/>
           <w:sz w:val="17"/>
         </w:rPr>
-        <w:t>• Supported operations team with shift scheduling, data verification, and service quality checks in Excel.</w:t>
+        <w:t>• Executed real-world AI &amp; robotics data collection adhering to strict quality protocols, verified input accuracy, and operational benchmarks.</w:t>
       </w:r>
     </w:p>
     <w:p>

</xml_diff>